<commit_message>
few edits on the pages
</commit_message>
<xml_diff>
--- a/documents/cv1.docx
+++ b/documents/cv1.docx
@@ -176,49 +176,14 @@
             <w:rStyle w:val="Hyperlink"/>
             <w:rFonts w:ascii="Times New Roman" w:hAnsi="Times New Roman" w:cs="Times New Roman"/>
           </w:rPr>
-          <w:t>erson</w:t>
+          <w:t>ersonal</w:t>
         </w:r>
         <w:r>
           <w:rPr>
             <w:rStyle w:val="Hyperlink"/>
             <w:rFonts w:ascii="Times New Roman" w:hAnsi="Times New Roman" w:cs="Times New Roman"/>
           </w:rPr>
-          <w:t>a</w:t>
-        </w:r>
-        <w:r>
-          <w:rPr>
-            <w:rStyle w:val="Hyperlink"/>
-            <w:rFonts w:ascii="Times New Roman" w:hAnsi="Times New Roman" w:cs="Times New Roman"/>
-          </w:rPr>
-          <w:t>l</w:t>
-        </w:r>
-        <w:r>
-          <w:rPr>
-            <w:rStyle w:val="Hyperlink"/>
-            <w:rFonts w:ascii="Times New Roman" w:hAnsi="Times New Roman" w:cs="Times New Roman"/>
-          </w:rPr>
-          <w:t xml:space="preserve"> </w:t>
-        </w:r>
-        <w:r>
-          <w:rPr>
-            <w:rStyle w:val="Hyperlink"/>
-            <w:rFonts w:ascii="Times New Roman" w:hAnsi="Times New Roman" w:cs="Times New Roman"/>
-          </w:rPr>
-          <w:t>W</w:t>
-        </w:r>
-        <w:r>
-          <w:rPr>
-            <w:rStyle w:val="Hyperlink"/>
-            <w:rFonts w:ascii="Times New Roman" w:hAnsi="Times New Roman" w:cs="Times New Roman"/>
-          </w:rPr>
-          <w:t>e</w:t>
-        </w:r>
-        <w:r>
-          <w:rPr>
-            <w:rStyle w:val="Hyperlink"/>
-            <w:rFonts w:ascii="Times New Roman" w:hAnsi="Times New Roman" w:cs="Times New Roman"/>
-          </w:rPr>
-          <w:t>bsite</w:t>
+          <w:t xml:space="preserve"> Website</w:t>
         </w:r>
       </w:hyperlink>
       <w:r>
@@ -1038,32 +1003,6 @@
           <w:rFonts w:ascii="Times New Roman" w:hAnsi="Times New Roman" w:cs="Times New Roman"/>
           <w:bCs/>
         </w:rPr>
-        <w:t>Improved the csky Python package (the standard tool for IceCube analysis) by adding new features for neutrino searches.</w:t>
-      </w:r>
-    </w:p>
-    <w:p>
-      <w:pPr>
-        <w:pStyle w:val="ListParagraph"/>
-        <w:numPr>
-          <w:ilvl w:val="0"/>
-          <w:numId w:val="39"/>
-        </w:numPr>
-        <w:tabs>
-          <w:tab w:val="left" w:pos="720"/>
-        </w:tabs>
-        <w:spacing w:after="0" w:line="240" w:lineRule="auto"/>
-        <w:ind w:right="207"/>
-        <w:jc w:val="both"/>
-        <w:rPr>
-          <w:rFonts w:ascii="Times New Roman" w:hAnsi="Times New Roman" w:cs="Times New Roman"/>
-          <w:bCs/>
-        </w:rPr>
-      </w:pPr>
-      <w:r>
-        <w:rPr>
-          <w:rFonts w:ascii="Times New Roman" w:hAnsi="Times New Roman" w:cs="Times New Roman"/>
-          <w:bCs/>
-        </w:rPr>
         <w:t>Performed statistical analysis of background an</w:t>
       </w:r>
       <w:r>
@@ -1699,7 +1638,6 @@
           <w:sz w:val="22"/>
           <w:szCs w:val="22"/>
         </w:rPr>
-        <w:lastRenderedPageBreak/>
         <w:t>Software Tools &amp; Version Control:</w:t>
       </w:r>
       <w:r>
@@ -1750,6 +1688,7 @@
           <w:szCs w:val="22"/>
           <w:u w:val="single"/>
         </w:rPr>
+        <w:lastRenderedPageBreak/>
         <w:t>PUBLICATIONS</w:t>
       </w:r>
       <w:r>
@@ -3358,7 +3297,6 @@
         <w:rPr>
           <w:rFonts w:ascii="Times New Roman" w:eastAsia="Times New Roman" w:hAnsi="Times New Roman" w:cs="Times New Roman"/>
         </w:rPr>
-        <w:lastRenderedPageBreak/>
         <w:t>Participated in the evaluation of an Assistant Professor’s RPT case, providing graduate student perspective on teaching, mentorship, and academic contributions.</w:t>
       </w:r>
     </w:p>
@@ -3378,6 +3316,7 @@
           <w:b/>
           <w:bCs/>
         </w:rPr>
+        <w:lastRenderedPageBreak/>
         <w:tab/>
         <w:t xml:space="preserve">President, Nepalese Student Association, University of Utah | </w:t>
       </w:r>

</xml_diff>